<commit_message>
cap nhat bao cao
</commit_message>
<xml_diff>
--- a/BaoCao/5.Architecture.docx
+++ b/BaoCao/5.Architecture.docx
@@ -19,6 +19,8 @@
           <w:szCs w:val="36"/>
         </w:rPr>
       </w:pPr>
+      <w:bookmarkStart w:id="19" w:name="_GoBack"/>
+      <w:bookmarkEnd w:id="19"/>
       <w:r>
         <w:rPr>
           <w:rFonts w:ascii="Times New Roman" w:hAnsi="Times New Roman" w:eastAsia="Calibri" w:cs="Times New Roman"/>
@@ -404,18 +406,36 @@
         </w:tabs>
         <w:spacing w:after="0" w:line="360" w:lineRule="auto"/>
         <w:rPr>
+          <w:rFonts w:hint="default" w:ascii="Times New Roman" w:hAnsi="Times New Roman" w:eastAsia="Calibri" w:cs="Times New Roman"/>
+          <w:sz w:val="26"/>
+          <w:szCs w:val="26"/>
+          <w:lang w:val="en-US"/>
+        </w:rPr>
+      </w:pPr>
+      <w:r>
+        <w:rPr>
+          <w:rFonts w:ascii="Times New Roman" w:hAnsi="Times New Roman" w:eastAsia="Calibri" w:cs="Times New Roman"/>
+          <w:sz w:val="36"/>
+          <w:szCs w:val="36"/>
+        </w:rPr>
+        <w:tab/>
+      </w:r>
+      <w:r>
+        <w:rPr>
           <w:rFonts w:ascii="Times New Roman" w:hAnsi="Times New Roman" w:eastAsia="Calibri" w:cs="Times New Roman"/>
           <w:sz w:val="26"/>
           <w:szCs w:val="26"/>
         </w:rPr>
-      </w:pPr>
+        <w:t xml:space="preserve">GVHD: </w:t>
+      </w:r>
       <w:r>
         <w:rPr>
-          <w:rFonts w:ascii="Times New Roman" w:hAnsi="Times New Roman" w:eastAsia="Calibri" w:cs="Times New Roman"/>
-          <w:sz w:val="36"/>
-          <w:szCs w:val="36"/>
-        </w:rPr>
-        <w:tab/>
+          <w:rFonts w:hint="default" w:ascii="Times New Roman" w:hAnsi="Times New Roman" w:eastAsia="Calibri" w:cs="Times New Roman"/>
+          <w:sz w:val="26"/>
+          <w:szCs w:val="26"/>
+          <w:lang w:val="en-US"/>
+        </w:rPr>
+        <w:t>Th.S Nguyễn Quốc Long</w:t>
       </w:r>
       <w:r>
         <w:rPr>
@@ -423,7 +443,16 @@
           <w:sz w:val="26"/>
           <w:szCs w:val="26"/>
         </w:rPr>
-        <w:t>GVHD: ……………….</w:t>
+        <w:t>…………</w:t>
+      </w:r>
+      <w:r>
+        <w:rPr>
+          <w:rFonts w:hint="default" w:ascii="Times New Roman" w:hAnsi="Times New Roman" w:eastAsia="Calibri" w:cs="Times New Roman"/>
+          <w:sz w:val="26"/>
+          <w:szCs w:val="26"/>
+          <w:lang w:val="en-US"/>
+        </w:rPr>
+        <w:t>.</w:t>
       </w:r>
     </w:p>
     <w:p>
@@ -491,27 +520,34 @@
       </w:r>
       <w:r>
         <w:rPr>
+          <w:rFonts w:hint="default" w:ascii="Times New Roman" w:hAnsi="Times New Roman" w:eastAsia="Calibri" w:cs="Times New Roman"/>
+          <w:sz w:val="26"/>
+          <w:szCs w:val="26"/>
+          <w:lang w:val="en-US"/>
+        </w:rPr>
+        <w:t>Phạm Phú Hưng</w:t>
+      </w:r>
+      <w:r>
+        <w:rPr>
           <w:rFonts w:ascii="Times New Roman" w:hAnsi="Times New Roman" w:eastAsia="Calibri" w:cs="Times New Roman"/>
           <w:sz w:val="26"/>
           <w:szCs w:val="26"/>
         </w:rPr>
-        <w:t>Nguyễn Văn A</w:t>
-      </w:r>
-      <w:r>
-        <w:rPr>
-          <w:rFonts w:ascii="Times New Roman" w:hAnsi="Times New Roman" w:eastAsia="Calibri" w:cs="Times New Roman"/>
-          <w:sz w:val="26"/>
-          <w:szCs w:val="26"/>
-        </w:rPr>
         <w:tab/>
       </w:r>
       <w:r>
         <w:rPr>
-          <w:rFonts w:ascii="Times New Roman" w:hAnsi="Times New Roman" w:eastAsia="Calibri" w:cs="Times New Roman"/>
+          <w:rFonts w:hint="default" w:ascii="Times New Roman" w:hAnsi="Times New Roman" w:eastAsia="Segoe UI" w:cs="Times New Roman"/>
+          <w:i w:val="0"/>
+          <w:iCs w:val="0"/>
+          <w:caps w:val="0"/>
+          <w:color w:val="081B3A"/>
+          <w:spacing w:val="2"/>
           <w:sz w:val="26"/>
           <w:szCs w:val="26"/>
-        </w:rPr>
-        <w:t>-23211……</w:t>
+          <w:shd w:val="clear" w:fill="FFFFFF"/>
+        </w:rPr>
+        <w:t>28210249524</w:t>
       </w:r>
     </w:p>
     <w:p>
@@ -528,11 +564,29 @@
         </w:tabs>
         <w:spacing w:after="0" w:line="360" w:lineRule="auto"/>
         <w:rPr>
+          <w:rFonts w:hint="default" w:ascii="Times New Roman" w:hAnsi="Times New Roman" w:eastAsia="Calibri" w:cs="Times New Roman"/>
+          <w:sz w:val="26"/>
+          <w:szCs w:val="26"/>
+          <w:lang w:val="en-US"/>
+        </w:rPr>
+      </w:pPr>
+      <w:r>
+        <w:rPr>
           <w:rFonts w:ascii="Times New Roman" w:hAnsi="Times New Roman" w:eastAsia="Calibri" w:cs="Times New Roman"/>
           <w:sz w:val="26"/>
           <w:szCs w:val="26"/>
         </w:rPr>
-      </w:pPr>
+        <w:tab/>
+      </w:r>
+      <w:r>
+        <w:rPr>
+          <w:rFonts w:hint="default" w:ascii="Times New Roman" w:hAnsi="Times New Roman" w:eastAsia="Calibri" w:cs="Times New Roman"/>
+          <w:sz w:val="26"/>
+          <w:szCs w:val="26"/>
+          <w:lang w:val="en-US"/>
+        </w:rPr>
+        <w:t>Nguyễn Đăng Khôi</w:t>
+      </w:r>
       <w:r>
         <w:rPr>
           <w:rFonts w:ascii="Times New Roman" w:hAnsi="Times New Roman" w:eastAsia="Calibri" w:cs="Times New Roman"/>
@@ -543,11 +597,34 @@
       </w:r>
       <w:r>
         <w:rPr>
+          <w:rFonts w:hint="default" w:ascii="Times New Roman" w:hAnsi="Times New Roman" w:eastAsia="Segoe UI" w:cs="Times New Roman"/>
+          <w:i w:val="0"/>
+          <w:iCs w:val="0"/>
+          <w:caps w:val="0"/>
+          <w:color w:val="081B3A"/>
+          <w:spacing w:val="2"/>
+          <w:sz w:val="26"/>
+          <w:szCs w:val="26"/>
+          <w:shd w:val="clear" w:fill="FFFFFF"/>
+        </w:rPr>
+        <w:t>28211152936</w:t>
+      </w:r>
+      <w:r>
+        <w:rPr>
           <w:rFonts w:ascii="Times New Roman" w:hAnsi="Times New Roman" w:eastAsia="Calibri" w:cs="Times New Roman"/>
           <w:sz w:val="26"/>
           <w:szCs w:val="26"/>
         </w:rPr>
-        <w:t>Nguyễn Thị B</w:t>
+        <w:tab/>
+      </w:r>
+      <w:r>
+        <w:rPr>
+          <w:rFonts w:hint="default" w:ascii="Times New Roman" w:hAnsi="Times New Roman" w:eastAsia="Calibri" w:cs="Times New Roman"/>
+          <w:sz w:val="26"/>
+          <w:szCs w:val="26"/>
+          <w:lang w:val="en-US"/>
+        </w:rPr>
+        <w:t>Trần Tấn Huy</w:t>
       </w:r>
       <w:r>
         <w:rPr>
@@ -559,99 +636,57 @@
       </w:r>
       <w:r>
         <w:rPr>
+          <w:rFonts w:hint="default" w:ascii="Times New Roman" w:hAnsi="Times New Roman" w:eastAsia="Segoe UI" w:cs="Times New Roman"/>
+          <w:i w:val="0"/>
+          <w:iCs w:val="0"/>
+          <w:caps w:val="0"/>
+          <w:color w:val="081B3A"/>
+          <w:spacing w:val="2"/>
+          <w:sz w:val="26"/>
+          <w:szCs w:val="26"/>
+          <w:shd w:val="clear" w:fill="FFFFFF"/>
+        </w:rPr>
+        <w:t>29214653925</w:t>
+      </w:r>
+      <w:r>
+        <w:rPr>
           <w:rFonts w:ascii="Times New Roman" w:hAnsi="Times New Roman" w:eastAsia="Calibri" w:cs="Times New Roman"/>
           <w:sz w:val="26"/>
           <w:szCs w:val="26"/>
         </w:rPr>
-        <w:t>-23211……</w:t>
-      </w:r>
-    </w:p>
-    <w:p>
-      <w:pPr>
-        <w:pBdr>
-          <w:top w:val="thinThickThinSmallGap" w:color="auto" w:sz="24" w:space="1"/>
-          <w:left w:val="thinThickThinSmallGap" w:color="auto" w:sz="24" w:space="4"/>
-          <w:bottom w:val="thinThickThinSmallGap" w:color="auto" w:sz="24" w:space="1"/>
-          <w:right w:val="thinThickThinSmallGap" w:color="auto" w:sz="24" w:space="4"/>
-        </w:pBdr>
-        <w:tabs>
-          <w:tab w:val="left" w:pos="4678"/>
-          <w:tab w:val="left" w:pos="7655"/>
-        </w:tabs>
-        <w:spacing w:after="0" w:line="360" w:lineRule="auto"/>
-        <w:rPr>
-          <w:rFonts w:ascii="Times New Roman" w:hAnsi="Times New Roman" w:eastAsia="Calibri" w:cs="Times New Roman"/>
-          <w:sz w:val="26"/>
-          <w:szCs w:val="26"/>
-        </w:rPr>
-      </w:pPr>
-      <w:r>
-        <w:rPr>
-          <w:rFonts w:ascii="Times New Roman" w:hAnsi="Times New Roman" w:eastAsia="Calibri" w:cs="Times New Roman"/>
-          <w:sz w:val="26"/>
-          <w:szCs w:val="26"/>
-        </w:rPr>
         <w:tab/>
       </w:r>
       <w:r>
         <w:rPr>
-          <w:rFonts w:ascii="Times New Roman" w:hAnsi="Times New Roman" w:eastAsia="Calibri" w:cs="Times New Roman"/>
+          <w:rFonts w:hint="default" w:ascii="Times New Roman" w:hAnsi="Times New Roman" w:eastAsia="Calibri" w:cs="Times New Roman"/>
           <w:sz w:val="26"/>
           <w:szCs w:val="26"/>
-        </w:rPr>
-        <w:t>Lê Văn C</w:t>
+          <w:lang w:val="en-US"/>
+        </w:rPr>
+        <w:t>Nguyễn Minh Khôi</w:t>
       </w:r>
       <w:r>
         <w:rPr>
-          <w:rFonts w:ascii="Times New Roman" w:hAnsi="Times New Roman" w:eastAsia="Calibri" w:cs="Times New Roman"/>
+          <w:rFonts w:hint="default" w:ascii="Times New Roman" w:hAnsi="Times New Roman" w:eastAsia="Calibri" w:cs="Times New Roman"/>
           <w:sz w:val="26"/>
           <w:szCs w:val="26"/>
+          <w:lang w:val="en-US"/>
         </w:rPr>
         <w:tab/>
       </w:r>
       <w:r>
         <w:rPr>
-          <w:rFonts w:ascii="Times New Roman" w:hAnsi="Times New Roman" w:eastAsia="Calibri" w:cs="Times New Roman"/>
+          <w:rFonts w:hint="default" w:ascii="Times New Roman" w:hAnsi="Times New Roman" w:eastAsia="Segoe UI" w:cs="Times New Roman"/>
+          <w:i w:val="0"/>
+          <w:iCs w:val="0"/>
+          <w:caps w:val="0"/>
+          <w:color w:val="081B3A"/>
+          <w:spacing w:val="2"/>
           <w:sz w:val="26"/>
           <w:szCs w:val="26"/>
-        </w:rPr>
-        <w:t>-23211……</w:t>
-      </w:r>
-    </w:p>
-    <w:p>
-      <w:pPr>
-        <w:pBdr>
-          <w:top w:val="thinThickThinSmallGap" w:color="auto" w:sz="24" w:space="1"/>
-          <w:left w:val="thinThickThinSmallGap" w:color="auto" w:sz="24" w:space="4"/>
-          <w:bottom w:val="thinThickThinSmallGap" w:color="auto" w:sz="24" w:space="1"/>
-          <w:right w:val="thinThickThinSmallGap" w:color="auto" w:sz="24" w:space="4"/>
-        </w:pBdr>
-        <w:tabs>
-          <w:tab w:val="left" w:pos="4678"/>
-          <w:tab w:val="left" w:pos="7655"/>
-        </w:tabs>
-        <w:spacing w:after="0" w:line="360" w:lineRule="auto"/>
-        <w:rPr>
-          <w:rFonts w:ascii="Times New Roman" w:hAnsi="Times New Roman" w:eastAsia="Calibri" w:cs="Times New Roman"/>
-          <w:sz w:val="26"/>
-          <w:szCs w:val="26"/>
-        </w:rPr>
-      </w:pPr>
-      <w:r>
-        <w:rPr>
-          <w:rFonts w:ascii="Times New Roman" w:hAnsi="Times New Roman" w:eastAsia="Calibri" w:cs="Times New Roman"/>
-          <w:sz w:val="26"/>
-          <w:szCs w:val="26"/>
-        </w:rPr>
-        <w:tab/>
-      </w:r>
-      <w:r>
-        <w:rPr>
-          <w:rFonts w:ascii="Times New Roman" w:hAnsi="Times New Roman" w:eastAsia="Calibri" w:cs="Times New Roman"/>
-          <w:sz w:val="26"/>
-          <w:szCs w:val="26"/>
-        </w:rPr>
-        <w:t>…….</w:t>
+          <w:shd w:val="clear" w:fill="FFFFFF"/>
+        </w:rPr>
+        <w:t>27211201759</w:t>
       </w:r>
     </w:p>
     <w:p>
@@ -798,10 +833,11 @@
         </w:tblCellMar>
       </w:tblPr>
       <w:tblGrid>
-        <w:gridCol w:w="1683"/>
-        <w:gridCol w:w="1889"/>
-        <w:gridCol w:w="3899"/>
-        <w:gridCol w:w="1817"/>
+        <w:gridCol w:w="1690"/>
+        <w:gridCol w:w="1867"/>
+        <w:gridCol w:w="56"/>
+        <w:gridCol w:w="3806"/>
+        <w:gridCol w:w="1869"/>
       </w:tblGrid>
       <w:tr>
         <w:tblPrEx>
@@ -825,13 +861,13 @@
         </w:trPr>
         <w:tc>
           <w:tcPr>
-            <w:tcW w:w="1701" w:type="dxa"/>
+            <w:tcW w:w="1690" w:type="dxa"/>
             <w:shd w:val="clear" w:color="auto" w:fill="DBE5F1" w:themeFill="accent1" w:themeFillTint="33"/>
+            <w:vAlign w:val="top"/>
           </w:tcPr>
           <w:p>
             <w:pPr>
               <w:spacing w:after="0" w:line="360" w:lineRule="auto"/>
-              <w:jc w:val="both"/>
               <w:rPr>
                 <w:rFonts w:ascii="Times New Roman" w:hAnsi="Times New Roman" w:eastAsia="Calibri" w:cs="Times New Roman"/>
                 <w:b/>
@@ -841,7 +877,7 @@
             </w:pPr>
             <w:r>
               <w:rPr>
-                <w:rFonts w:ascii="Times New Roman" w:hAnsi="Times New Roman" w:eastAsia="Calibri" w:cs="Times New Roman"/>
+                <w:rFonts w:ascii="Times New Roman" w:hAnsi="Times New Roman" w:cs="Times New Roman"/>
                 <w:b/>
                 <w:sz w:val="26"/>
                 <w:szCs w:val="26"/>
@@ -852,19 +888,29 @@
         </w:tc>
         <w:tc>
           <w:tcPr>
-            <w:tcW w:w="7655" w:type="dxa"/>
-            <w:gridSpan w:val="3"/>
+            <w:tcW w:w="7598" w:type="dxa"/>
+            <w:gridSpan w:val="4"/>
+            <w:vAlign w:val="top"/>
           </w:tcPr>
           <w:p>
             <w:pPr>
               <w:spacing w:after="0" w:line="360" w:lineRule="auto"/>
-              <w:jc w:val="both"/>
-              <w:rPr>
-                <w:rFonts w:ascii="Times New Roman" w:hAnsi="Times New Roman" w:eastAsia="Calibri" w:cs="Times New Roman"/>
-                <w:sz w:val="26"/>
-                <w:szCs w:val="26"/>
-              </w:rPr>
-            </w:pPr>
+              <w:rPr>
+                <w:rFonts w:hint="default" w:ascii="Times New Roman" w:hAnsi="Times New Roman" w:eastAsia="Calibri" w:cs="Times New Roman"/>
+                <w:sz w:val="26"/>
+                <w:szCs w:val="26"/>
+                <w:lang w:val="en-US"/>
+              </w:rPr>
+            </w:pPr>
+            <w:r>
+              <w:rPr>
+                <w:rFonts w:hint="default" w:ascii="Times New Roman" w:hAnsi="Times New Roman" w:cs="Times New Roman"/>
+                <w:sz w:val="26"/>
+                <w:szCs w:val="26"/>
+                <w:lang w:val="en-US"/>
+              </w:rPr>
+              <w:t>SMARTTRIAL</w:t>
+            </w:r>
           </w:p>
         </w:tc>
       </w:tr>
@@ -890,13 +936,13 @@
         </w:trPr>
         <w:tc>
           <w:tcPr>
-            <w:tcW w:w="1701" w:type="dxa"/>
+            <w:tcW w:w="1690" w:type="dxa"/>
             <w:shd w:val="clear" w:color="auto" w:fill="DBE5F1" w:themeFill="accent1" w:themeFillTint="33"/>
+            <w:vAlign w:val="top"/>
           </w:tcPr>
           <w:p>
             <w:pPr>
               <w:spacing w:after="0" w:line="360" w:lineRule="auto"/>
-              <w:jc w:val="both"/>
               <w:rPr>
                 <w:rFonts w:ascii="Times New Roman" w:hAnsi="Times New Roman" w:eastAsia="Calibri" w:cs="Times New Roman"/>
                 <w:b/>
@@ -906,37 +952,38 @@
             </w:pPr>
             <w:r>
               <w:rPr>
+                <w:rFonts w:ascii="Times New Roman" w:hAnsi="Times New Roman" w:cs="Times New Roman"/>
+                <w:b/>
+                <w:sz w:val="26"/>
+                <w:szCs w:val="26"/>
+              </w:rPr>
+              <w:t>Tên dự án</w:t>
+            </w:r>
+          </w:p>
+        </w:tc>
+        <w:tc>
+          <w:tcPr>
+            <w:tcW w:w="7598" w:type="dxa"/>
+            <w:gridSpan w:val="4"/>
+            <w:vAlign w:val="top"/>
+          </w:tcPr>
+          <w:p>
+            <w:pPr>
+              <w:spacing w:after="0" w:line="360" w:lineRule="auto"/>
+              <w:rPr>
                 <w:rFonts w:ascii="Times New Roman" w:hAnsi="Times New Roman" w:eastAsia="Calibri" w:cs="Times New Roman"/>
-                <w:b/>
-                <w:sz w:val="26"/>
-                <w:szCs w:val="26"/>
-              </w:rPr>
-              <w:t>Tên dự án</w:t>
-            </w:r>
-          </w:p>
-        </w:tc>
-        <w:tc>
-          <w:tcPr>
-            <w:tcW w:w="7655" w:type="dxa"/>
-            <w:gridSpan w:val="3"/>
-          </w:tcPr>
-          <w:p>
-            <w:pPr>
-              <w:spacing w:after="0" w:line="360" w:lineRule="auto"/>
-              <w:jc w:val="both"/>
-              <w:rPr>
-                <w:rFonts w:ascii="Times New Roman" w:hAnsi="Times New Roman" w:eastAsia="Calibri" w:cs="Times New Roman"/>
-                <w:sz w:val="26"/>
-                <w:szCs w:val="26"/>
-              </w:rPr>
-            </w:pPr>
-            <w:r>
-              <w:rPr>
-                <w:rFonts w:ascii="Times New Roman" w:hAnsi="Times New Roman" w:eastAsia="Calibri" w:cs="Times New Roman"/>
-                <w:sz w:val="26"/>
-                <w:szCs w:val="26"/>
-              </w:rPr>
-              <w:t>Xây dựng website bán hàng tích hợp AI tìm kiếm</w:t>
+                <w:sz w:val="26"/>
+                <w:szCs w:val="26"/>
+              </w:rPr>
+            </w:pPr>
+            <w:r>
+              <w:rPr>
+                <w:rFonts w:hint="default" w:ascii="Times New Roman" w:hAnsi="Times New Roman" w:cs="Times New Roman"/>
+                <w:sz w:val="26"/>
+                <w:szCs w:val="26"/>
+                <w:lang w:val="en-US"/>
+              </w:rPr>
+              <w:t>Nền tảng đặt lịch học thử và tư vấn trực tuyến realtime với cơ chế xếp lịch thông minh</w:t>
             </w:r>
           </w:p>
         </w:tc>
@@ -963,13 +1010,13 @@
         </w:trPr>
         <w:tc>
           <w:tcPr>
-            <w:tcW w:w="1701" w:type="dxa"/>
+            <w:tcW w:w="1690" w:type="dxa"/>
             <w:shd w:val="clear" w:color="auto" w:fill="DBE5F1" w:themeFill="accent1" w:themeFillTint="33"/>
+            <w:vAlign w:val="top"/>
           </w:tcPr>
           <w:p>
             <w:pPr>
               <w:spacing w:after="0" w:line="360" w:lineRule="auto"/>
-              <w:jc w:val="both"/>
               <w:rPr>
                 <w:rFonts w:ascii="Times New Roman" w:hAnsi="Times New Roman" w:eastAsia="Calibri" w:cs="Times New Roman"/>
                 <w:b/>
@@ -979,87 +1026,160 @@
             </w:pPr>
             <w:r>
               <w:rPr>
+                <w:rFonts w:ascii="Times New Roman" w:hAnsi="Times New Roman" w:cs="Times New Roman"/>
+                <w:b/>
+                <w:sz w:val="26"/>
+                <w:szCs w:val="26"/>
+              </w:rPr>
+              <w:t>Ngày bắt đầu</w:t>
+            </w:r>
+          </w:p>
+        </w:tc>
+        <w:tc>
+          <w:tcPr>
+            <w:tcW w:w="1867" w:type="dxa"/>
+            <w:vAlign w:val="top"/>
+          </w:tcPr>
+          <w:p>
+            <w:pPr>
+              <w:spacing w:after="0" w:line="360" w:lineRule="auto"/>
+              <w:rPr>
+                <w:rFonts w:hint="default" w:ascii="Times New Roman" w:hAnsi="Times New Roman" w:eastAsia="Calibri" w:cs="Times New Roman"/>
+                <w:sz w:val="26"/>
+                <w:szCs w:val="26"/>
+                <w:lang w:val="en-US"/>
+              </w:rPr>
+            </w:pPr>
+            <w:r>
+              <w:rPr>
+                <w:rFonts w:hint="default" w:ascii="Times New Roman" w:hAnsi="Times New Roman" w:cs="Times New Roman"/>
+                <w:sz w:val="26"/>
+                <w:szCs w:val="26"/>
+                <w:lang w:val="en-US"/>
+              </w:rPr>
+              <w:t>10</w:t>
+            </w:r>
+            <w:r>
+              <w:rPr>
+                <w:rFonts w:ascii="Times New Roman" w:hAnsi="Times New Roman" w:cs="Times New Roman"/>
+                <w:sz w:val="26"/>
+                <w:szCs w:val="26"/>
+              </w:rPr>
+              <w:t>/</w:t>
+            </w:r>
+            <w:r>
+              <w:rPr>
+                <w:rFonts w:hint="default" w:ascii="Times New Roman" w:hAnsi="Times New Roman" w:cs="Times New Roman"/>
+                <w:sz w:val="26"/>
+                <w:szCs w:val="26"/>
+                <w:lang w:val="en-US"/>
+              </w:rPr>
+              <w:t>08</w:t>
+            </w:r>
+            <w:r>
+              <w:rPr>
+                <w:rFonts w:ascii="Times New Roman" w:hAnsi="Times New Roman" w:cs="Times New Roman"/>
+                <w:sz w:val="26"/>
+                <w:szCs w:val="26"/>
+              </w:rPr>
+              <w:t>/202</w:t>
+            </w:r>
+            <w:r>
+              <w:rPr>
+                <w:rFonts w:hint="default" w:ascii="Times New Roman" w:hAnsi="Times New Roman" w:cs="Times New Roman"/>
+                <w:sz w:val="26"/>
+                <w:szCs w:val="26"/>
+                <w:lang w:val="en-US"/>
+              </w:rPr>
+              <w:t>6</w:t>
+            </w:r>
+          </w:p>
+        </w:tc>
+        <w:tc>
+          <w:tcPr>
+            <w:tcW w:w="3862" w:type="dxa"/>
+            <w:gridSpan w:val="2"/>
+            <w:shd w:val="clear" w:color="auto" w:fill="DBE5F1" w:themeFill="accent1" w:themeFillTint="33"/>
+            <w:vAlign w:val="top"/>
+          </w:tcPr>
+          <w:p>
+            <w:pPr>
+              <w:spacing w:after="0" w:line="360" w:lineRule="auto"/>
+              <w:rPr>
                 <w:rFonts w:ascii="Times New Roman" w:hAnsi="Times New Roman" w:eastAsia="Calibri" w:cs="Times New Roman"/>
                 <w:b/>
                 <w:sz w:val="26"/>
                 <w:szCs w:val="26"/>
               </w:rPr>
-              <w:t>Ngày bắt đầu</w:t>
-            </w:r>
-          </w:p>
-        </w:tc>
-        <w:tc>
-          <w:tcPr>
-            <w:tcW w:w="1901" w:type="dxa"/>
+            </w:pPr>
+            <w:r>
+              <w:rPr>
+                <w:rFonts w:ascii="Times New Roman" w:hAnsi="Times New Roman" w:cs="Times New Roman"/>
+                <w:b/>
+                <w:sz w:val="26"/>
+                <w:szCs w:val="26"/>
+              </w:rPr>
+              <w:t>Ngày kết thúc</w:t>
+            </w:r>
+          </w:p>
+        </w:tc>
+        <w:tc>
+          <w:tcPr>
+            <w:tcW w:w="1869" w:type="dxa"/>
+            <w:vAlign w:val="top"/>
           </w:tcPr>
           <w:p>
             <w:pPr>
               <w:spacing w:after="0" w:line="360" w:lineRule="auto"/>
-              <w:jc w:val="both"/>
-              <w:rPr>
-                <w:rFonts w:ascii="Times New Roman" w:hAnsi="Times New Roman" w:eastAsia="Calibri" w:cs="Times New Roman"/>
-                <w:sz w:val="26"/>
-                <w:szCs w:val="26"/>
-              </w:rPr>
-            </w:pPr>
-            <w:r>
-              <w:rPr>
-                <w:rFonts w:ascii="Times New Roman" w:hAnsi="Times New Roman" w:eastAsia="Calibri" w:cs="Times New Roman"/>
-                <w:sz w:val="26"/>
-                <w:szCs w:val="26"/>
-              </w:rPr>
-              <w:t>01/03/2021</w:t>
-            </w:r>
-          </w:p>
-        </w:tc>
-        <w:tc>
-          <w:tcPr>
-            <w:tcW w:w="3929" w:type="dxa"/>
-            <w:shd w:val="clear" w:color="auto" w:fill="DBE5F1" w:themeFill="accent1" w:themeFillTint="33"/>
-          </w:tcPr>
-          <w:p>
-            <w:pPr>
-              <w:spacing w:after="0" w:line="360" w:lineRule="auto"/>
-              <w:jc w:val="both"/>
-              <w:rPr>
-                <w:rFonts w:ascii="Times New Roman" w:hAnsi="Times New Roman" w:eastAsia="Calibri" w:cs="Times New Roman"/>
-                <w:b/>
-                <w:sz w:val="26"/>
-                <w:szCs w:val="26"/>
-              </w:rPr>
-            </w:pPr>
-            <w:r>
-              <w:rPr>
-                <w:rFonts w:ascii="Times New Roman" w:hAnsi="Times New Roman" w:eastAsia="Calibri" w:cs="Times New Roman"/>
-                <w:b/>
-                <w:sz w:val="26"/>
-                <w:szCs w:val="26"/>
-              </w:rPr>
-              <w:t>Ngày kết thúc</w:t>
-            </w:r>
-          </w:p>
-        </w:tc>
-        <w:tc>
-          <w:tcPr>
-            <w:tcW w:w="1825" w:type="dxa"/>
-          </w:tcPr>
-          <w:p>
-            <w:pPr>
-              <w:spacing w:after="0" w:line="360" w:lineRule="auto"/>
-              <w:jc w:val="both"/>
-              <w:rPr>
-                <w:rFonts w:ascii="Times New Roman" w:hAnsi="Times New Roman" w:eastAsia="Calibri" w:cs="Times New Roman"/>
-                <w:sz w:val="26"/>
-                <w:szCs w:val="26"/>
-              </w:rPr>
-            </w:pPr>
-            <w:r>
-              <w:rPr>
-                <w:rFonts w:ascii="Times New Roman" w:hAnsi="Times New Roman" w:eastAsia="Calibri" w:cs="Times New Roman"/>
-                <w:sz w:val="26"/>
-                <w:szCs w:val="26"/>
-              </w:rPr>
-              <w:t>20/05/2021</w:t>
+              <w:rPr>
+                <w:rFonts w:hint="default" w:ascii="Times New Roman" w:hAnsi="Times New Roman" w:eastAsia="Calibri" w:cs="Times New Roman"/>
+                <w:sz w:val="26"/>
+                <w:szCs w:val="26"/>
+                <w:lang w:val="en-US"/>
+              </w:rPr>
+            </w:pPr>
+            <w:r>
+              <w:rPr>
+                <w:rFonts w:hint="default" w:ascii="Times New Roman" w:hAnsi="Times New Roman" w:cs="Times New Roman"/>
+                <w:sz w:val="26"/>
+                <w:szCs w:val="26"/>
+                <w:lang w:val="en-US"/>
+              </w:rPr>
+              <w:t>04</w:t>
+            </w:r>
+            <w:r>
+              <w:rPr>
+                <w:rFonts w:ascii="Times New Roman" w:hAnsi="Times New Roman" w:cs="Times New Roman"/>
+                <w:sz w:val="26"/>
+                <w:szCs w:val="26"/>
+              </w:rPr>
+              <w:t>/</w:t>
+            </w:r>
+            <w:r>
+              <w:rPr>
+                <w:rFonts w:hint="default" w:ascii="Times New Roman" w:hAnsi="Times New Roman" w:cs="Times New Roman"/>
+                <w:sz w:val="26"/>
+                <w:szCs w:val="26"/>
+                <w:lang w:val="en-US"/>
+              </w:rPr>
+              <w:t>10</w:t>
+            </w:r>
+            <w:r>
+              <w:rPr>
+                <w:rFonts w:ascii="Times New Roman" w:hAnsi="Times New Roman" w:cs="Times New Roman"/>
+                <w:sz w:val="26"/>
+                <w:szCs w:val="26"/>
+              </w:rPr>
+              <w:t>/202</w:t>
+            </w:r>
+            <w:r>
+              <w:rPr>
+                <w:rFonts w:hint="default" w:ascii="Times New Roman" w:hAnsi="Times New Roman" w:cs="Times New Roman"/>
+                <w:sz w:val="26"/>
+                <w:szCs w:val="26"/>
+                <w:lang w:val="en-US"/>
+              </w:rPr>
+              <w:t>6</w:t>
             </w:r>
           </w:p>
         </w:tc>
@@ -1086,13 +1206,13 @@
         </w:trPr>
         <w:tc>
           <w:tcPr>
-            <w:tcW w:w="1701" w:type="dxa"/>
+            <w:tcW w:w="1690" w:type="dxa"/>
             <w:shd w:val="clear" w:color="auto" w:fill="DBE5F1" w:themeFill="accent1" w:themeFillTint="33"/>
+            <w:vAlign w:val="top"/>
           </w:tcPr>
           <w:p>
             <w:pPr>
               <w:spacing w:after="0" w:line="360" w:lineRule="auto"/>
-              <w:jc w:val="both"/>
               <w:rPr>
                 <w:rFonts w:ascii="Times New Roman" w:hAnsi="Times New Roman" w:eastAsia="Calibri" w:cs="Times New Roman"/>
                 <w:b/>
@@ -1102,37 +1222,37 @@
             </w:pPr>
             <w:r>
               <w:rPr>
+                <w:rFonts w:ascii="Times New Roman" w:hAnsi="Times New Roman" w:cs="Times New Roman"/>
+                <w:b/>
+                <w:sz w:val="26"/>
+                <w:szCs w:val="26"/>
+              </w:rPr>
+              <w:t>Nơi thực hiện</w:t>
+            </w:r>
+          </w:p>
+        </w:tc>
+        <w:tc>
+          <w:tcPr>
+            <w:tcW w:w="7598" w:type="dxa"/>
+            <w:gridSpan w:val="4"/>
+            <w:vAlign w:val="top"/>
+          </w:tcPr>
+          <w:p>
+            <w:pPr>
+              <w:spacing w:after="0" w:line="360" w:lineRule="auto"/>
+              <w:rPr>
                 <w:rFonts w:ascii="Times New Roman" w:hAnsi="Times New Roman" w:eastAsia="Calibri" w:cs="Times New Roman"/>
-                <w:b/>
-                <w:sz w:val="26"/>
-                <w:szCs w:val="26"/>
-              </w:rPr>
-              <w:t>Nơi thực hiện</w:t>
-            </w:r>
-          </w:p>
-        </w:tc>
-        <w:tc>
-          <w:tcPr>
-            <w:tcW w:w="7655" w:type="dxa"/>
-            <w:gridSpan w:val="3"/>
-          </w:tcPr>
-          <w:p>
-            <w:pPr>
-              <w:spacing w:after="0" w:line="360" w:lineRule="auto"/>
-              <w:jc w:val="both"/>
-              <w:rPr>
-                <w:rFonts w:ascii="Times New Roman" w:hAnsi="Times New Roman" w:eastAsia="Calibri" w:cs="Times New Roman"/>
-                <w:sz w:val="26"/>
-                <w:szCs w:val="26"/>
-              </w:rPr>
-            </w:pPr>
-            <w:r>
-              <w:rPr>
-                <w:rFonts w:ascii="Times New Roman" w:hAnsi="Times New Roman" w:eastAsia="Calibri" w:cs="Times New Roman"/>
-                <w:sz w:val="26"/>
-                <w:szCs w:val="26"/>
-              </w:rPr>
-              <w:t>Khoa Công nghệ thông tin – Đại học Duy Tân</w:t>
+                <w:sz w:val="26"/>
+                <w:szCs w:val="26"/>
+              </w:rPr>
+            </w:pPr>
+            <w:r>
+              <w:rPr>
+                <w:rFonts w:ascii="Times New Roman" w:hAnsi="Times New Roman" w:cs="Times New Roman"/>
+                <w:sz w:val="26"/>
+                <w:szCs w:val="26"/>
+              </w:rPr>
+              <w:t>Khoa Công Nghệ Thông Tin – Đại học Duy Tân</w:t>
             </w:r>
           </w:p>
         </w:tc>
@@ -1159,13 +1279,13 @@
         </w:trPr>
         <w:tc>
           <w:tcPr>
-            <w:tcW w:w="1701" w:type="dxa"/>
+            <w:tcW w:w="1690" w:type="dxa"/>
             <w:shd w:val="clear" w:color="auto" w:fill="DBE5F1" w:themeFill="accent1" w:themeFillTint="33"/>
+            <w:vAlign w:val="top"/>
           </w:tcPr>
           <w:p>
             <w:pPr>
               <w:spacing w:after="0" w:line="360" w:lineRule="auto"/>
-              <w:jc w:val="both"/>
               <w:rPr>
                 <w:rFonts w:ascii="Times New Roman" w:hAnsi="Times New Roman" w:eastAsia="Calibri" w:cs="Times New Roman"/>
                 <w:b/>
@@ -1175,7 +1295,7 @@
             </w:pPr>
             <w:r>
               <w:rPr>
-                <w:rFonts w:ascii="Times New Roman" w:hAnsi="Times New Roman" w:eastAsia="Calibri" w:cs="Times New Roman"/>
+                <w:rFonts w:ascii="Times New Roman" w:hAnsi="Times New Roman" w:cs="Times New Roman"/>
                 <w:b/>
                 <w:sz w:val="26"/>
                 <w:szCs w:val="26"/>
@@ -1186,8 +1306,9 @@
         </w:tc>
         <w:tc>
           <w:tcPr>
-            <w:tcW w:w="7655" w:type="dxa"/>
-            <w:gridSpan w:val="3"/>
+            <w:tcW w:w="7598" w:type="dxa"/>
+            <w:gridSpan w:val="4"/>
+            <w:vAlign w:val="top"/>
           </w:tcPr>
           <w:p>
             <w:pPr>
@@ -1204,7 +1325,24 @@
                 <w:sz w:val="26"/>
                 <w:szCs w:val="26"/>
               </w:rPr>
-              <w:t>ThS. ……………</w:t>
+              <w:t>ThS. …</w:t>
+            </w:r>
+            <w:r>
+              <w:rPr>
+                <w:rFonts w:hint="default" w:ascii="Times New Roman" w:hAnsi="Times New Roman" w:cs="Times New Roman"/>
+                <w:sz w:val="26"/>
+                <w:szCs w:val="26"/>
+                <w:lang w:val="en-US"/>
+              </w:rPr>
+              <w:t>Nguyễn Quốc Long</w:t>
+            </w:r>
+            <w:r>
+              <w:rPr>
+                <w:rFonts w:ascii="Times New Roman" w:hAnsi="Times New Roman" w:cs="Times New Roman"/>
+                <w:sz w:val="26"/>
+                <w:szCs w:val="26"/>
+              </w:rPr>
+              <w:t>…………</w:t>
             </w:r>
           </w:p>
           <w:p>
@@ -1223,6 +1361,15 @@
                 <w:szCs w:val="26"/>
               </w:rPr>
               <w:t xml:space="preserve">Email: </w:t>
+            </w:r>
+            <w:r>
+              <w:rPr>
+                <w:rFonts w:hint="default" w:ascii="Times New Roman" w:hAnsi="Times New Roman" w:cs="Times New Roman"/>
+                <w:sz w:val="26"/>
+                <w:szCs w:val="26"/>
+                <w:lang w:val="en-US"/>
+              </w:rPr>
+              <w:t>quoclongdng@gmail.com</w:t>
             </w:r>
             <w:r>
               <w:fldChar w:fldCharType="begin"/>
@@ -1258,7 +1405,6 @@
           <w:p>
             <w:pPr>
               <w:spacing w:after="0" w:line="360" w:lineRule="auto"/>
-              <w:jc w:val="both"/>
               <w:rPr>
                 <w:rFonts w:ascii="Times New Roman" w:hAnsi="Times New Roman" w:eastAsia="Calibri" w:cs="Times New Roman"/>
                 <w:sz w:val="26"/>
@@ -1298,13 +1444,13 @@
         </w:trPr>
         <w:tc>
           <w:tcPr>
-            <w:tcW w:w="1701" w:type="dxa"/>
+            <w:tcW w:w="1690" w:type="dxa"/>
             <w:shd w:val="clear" w:color="auto" w:fill="DBE5F1" w:themeFill="accent1" w:themeFillTint="33"/>
+            <w:vAlign w:val="top"/>
           </w:tcPr>
           <w:p>
             <w:pPr>
               <w:spacing w:after="0" w:line="360" w:lineRule="auto"/>
-              <w:jc w:val="both"/>
               <w:rPr>
                 <w:rFonts w:ascii="Times New Roman" w:hAnsi="Times New Roman" w:eastAsia="Calibri" w:cs="Times New Roman"/>
                 <w:b/>
@@ -1314,19 +1460,20 @@
             </w:pPr>
             <w:r>
               <w:rPr>
-                <w:rFonts w:ascii="Times New Roman" w:hAnsi="Times New Roman" w:eastAsia="Calibri" w:cs="Times New Roman"/>
+                <w:rFonts w:ascii="Times New Roman" w:hAnsi="Times New Roman" w:cs="Times New Roman"/>
                 <w:b/>
                 <w:sz w:val="26"/>
                 <w:szCs w:val="26"/>
               </w:rPr>
-              <w:t>Chủ sở hữu</w:t>
-            </w:r>
-          </w:p>
-        </w:tc>
-        <w:tc>
-          <w:tcPr>
-            <w:tcW w:w="7655" w:type="dxa"/>
-            <w:gridSpan w:val="3"/>
+              <w:t>Chủ sở hửu</w:t>
+            </w:r>
+          </w:p>
+        </w:tc>
+        <w:tc>
+          <w:tcPr>
+            <w:tcW w:w="7598" w:type="dxa"/>
+            <w:gridSpan w:val="4"/>
+            <w:vAlign w:val="top"/>
           </w:tcPr>
           <w:p>
             <w:pPr>
@@ -1343,7 +1490,24 @@
                 <w:sz w:val="26"/>
                 <w:szCs w:val="26"/>
               </w:rPr>
-              <w:t>ThS. ……………</w:t>
+              <w:t>. …</w:t>
+            </w:r>
+            <w:r>
+              <w:rPr>
+                <w:rFonts w:hint="default" w:ascii="Times New Roman" w:hAnsi="Times New Roman" w:cs="Times New Roman"/>
+                <w:sz w:val="26"/>
+                <w:szCs w:val="26"/>
+                <w:lang w:val="en-US"/>
+              </w:rPr>
+              <w:t>Phạm Phú Hưng</w:t>
+            </w:r>
+            <w:r>
+              <w:rPr>
+                <w:rFonts w:ascii="Times New Roman" w:hAnsi="Times New Roman" w:cs="Times New Roman"/>
+                <w:sz w:val="26"/>
+                <w:szCs w:val="26"/>
+              </w:rPr>
+              <w:t>…………</w:t>
             </w:r>
           </w:p>
           <w:p>
@@ -1362,6 +1526,15 @@
                 <w:szCs w:val="26"/>
               </w:rPr>
               <w:t xml:space="preserve">Email: </w:t>
+            </w:r>
+            <w:r>
+              <w:rPr>
+                <w:rFonts w:hint="default" w:ascii="Times New Roman" w:hAnsi="Times New Roman" w:cs="Times New Roman"/>
+                <w:sz w:val="26"/>
+                <w:szCs w:val="26"/>
+                <w:lang w:val="en-US"/>
+              </w:rPr>
+              <w:t>ppHung@gmail.com</w:t>
             </w:r>
             <w:r>
               <w:fldChar w:fldCharType="begin"/>
@@ -1397,7 +1570,6 @@
           <w:p>
             <w:pPr>
               <w:spacing w:after="0" w:line="360" w:lineRule="auto"/>
-              <w:jc w:val="both"/>
               <w:rPr>
                 <w:rFonts w:ascii="Times New Roman" w:hAnsi="Times New Roman" w:eastAsia="Calibri" w:cs="Times New Roman"/>
                 <w:sz w:val="26"/>
@@ -1437,13 +1609,13 @@
         </w:trPr>
         <w:tc>
           <w:tcPr>
-            <w:tcW w:w="1701" w:type="dxa"/>
+            <w:tcW w:w="1690" w:type="dxa"/>
             <w:shd w:val="clear" w:color="auto" w:fill="DBE5F1" w:themeFill="accent1" w:themeFillTint="33"/>
+            <w:vAlign w:val="top"/>
           </w:tcPr>
           <w:p>
             <w:pPr>
               <w:spacing w:after="0" w:line="360" w:lineRule="auto"/>
-              <w:jc w:val="both"/>
               <w:rPr>
                 <w:rFonts w:ascii="Times New Roman" w:hAnsi="Times New Roman" w:eastAsia="Calibri" w:cs="Times New Roman"/>
                 <w:b/>
@@ -1453,39 +1625,79 @@
             </w:pPr>
             <w:r>
               <w:rPr>
+                <w:rFonts w:ascii="Times New Roman" w:hAnsi="Times New Roman" w:cs="Times New Roman"/>
+                <w:b/>
+                <w:sz w:val="26"/>
+                <w:szCs w:val="26"/>
+              </w:rPr>
+              <w:t>Quản lý dự án</w:t>
+            </w:r>
+          </w:p>
+        </w:tc>
+        <w:tc>
+          <w:tcPr>
+            <w:tcW w:w="1923" w:type="dxa"/>
+            <w:gridSpan w:val="2"/>
+            <w:vAlign w:val="top"/>
+          </w:tcPr>
+          <w:p>
+            <w:pPr>
+              <w:spacing w:after="0" w:line="360" w:lineRule="auto"/>
+              <w:rPr>
                 <w:rFonts w:ascii="Times New Roman" w:hAnsi="Times New Roman" w:eastAsia="Calibri" w:cs="Times New Roman"/>
-                <w:b/>
-                <w:sz w:val="26"/>
-                <w:szCs w:val="26"/>
-              </w:rPr>
-              <w:t>Quản lý dự án</w:t>
-            </w:r>
-          </w:p>
-        </w:tc>
-        <w:tc>
-          <w:tcPr>
-            <w:tcW w:w="1901" w:type="dxa"/>
+                <w:sz w:val="26"/>
+                <w:szCs w:val="26"/>
+              </w:rPr>
+            </w:pPr>
+            <w:r>
+              <w:rPr>
+                <w:rFonts w:hint="default" w:ascii="Times New Roman" w:hAnsi="Times New Roman" w:eastAsia="Segoe UI" w:cs="Times New Roman"/>
+                <w:i w:val="0"/>
+                <w:iCs w:val="0"/>
+                <w:caps w:val="0"/>
+                <w:color w:val="081B3A"/>
+                <w:spacing w:val="2"/>
+                <w:sz w:val="26"/>
+                <w:szCs w:val="26"/>
+                <w:shd w:val="clear" w:fill="FFFFFF"/>
+              </w:rPr>
+              <w:t>28211152936</w:t>
+            </w:r>
+          </w:p>
+        </w:tc>
+        <w:tc>
+          <w:tcPr>
+            <w:tcW w:w="3806" w:type="dxa"/>
+            <w:vAlign w:val="top"/>
           </w:tcPr>
           <w:p>
             <w:pPr>
               <w:spacing w:after="0" w:line="360" w:lineRule="auto"/>
-              <w:jc w:val="both"/>
               <w:rPr>
                 <w:rFonts w:ascii="Times New Roman" w:hAnsi="Times New Roman" w:eastAsia="Calibri" w:cs="Times New Roman"/>
                 <w:sz w:val="26"/>
                 <w:szCs w:val="26"/>
               </w:rPr>
             </w:pPr>
-          </w:p>
-        </w:tc>
-        <w:tc>
-          <w:tcPr>
-            <w:tcW w:w="3929" w:type="dxa"/>
+            <w:r>
+              <w:rPr>
+                <w:rFonts w:hint="default" w:ascii="Times New Roman" w:hAnsi="Times New Roman" w:cs="Times New Roman"/>
+                <w:sz w:val="26"/>
+                <w:szCs w:val="26"/>
+                <w:lang w:val="en-US"/>
+              </w:rPr>
+              <w:t>Nguyễn Đăng Khôi</w:t>
+            </w:r>
+          </w:p>
+        </w:tc>
+        <w:tc>
+          <w:tcPr>
+            <w:tcW w:w="1869" w:type="dxa"/>
+            <w:vAlign w:val="top"/>
           </w:tcPr>
           <w:p>
             <w:pPr>
               <w:spacing w:after="0" w:line="360" w:lineRule="auto"/>
-              <w:jc w:val="both"/>
               <w:rPr>
                 <w:rFonts w:ascii="Times New Roman" w:hAnsi="Times New Roman" w:eastAsia="Calibri" w:cs="Times New Roman"/>
                 <w:sz w:val="26"/>
@@ -1493,79 +1705,14 @@
               </w:rPr>
             </w:pPr>
             <w:r>
-              <w:fldChar w:fldCharType="begin"/>
-            </w:r>
-            <w:r>
-              <w:instrText xml:space="preserve"> HYPERLINK "mailto:....................@gmail.com" </w:instrText>
-            </w:r>
-            <w:r>
-              <w:fldChar w:fldCharType="separate"/>
-            </w:r>
-            <w:r>
-              <w:rPr>
-                <w:rStyle w:val="8"/>
-                <w:rFonts w:ascii="Times New Roman" w:hAnsi="Times New Roman" w:eastAsia="Calibri" w:cs="Times New Roman"/>
-                <w:sz w:val="26"/>
-                <w:szCs w:val="26"/>
-              </w:rPr>
-              <w:t>.</w:t>
-            </w:r>
-            <w:r>
-              <w:rPr>
-                <w:rStyle w:val="8"/>
-                <w:rFonts w:eastAsia="Calibri"/>
-              </w:rPr>
-              <w:t>...................</w:t>
-            </w:r>
-            <w:r>
-              <w:rPr>
-                <w:rStyle w:val="8"/>
-                <w:rFonts w:ascii="Times New Roman" w:hAnsi="Times New Roman" w:eastAsia="Calibri" w:cs="Times New Roman"/>
-                <w:sz w:val="26"/>
-                <w:szCs w:val="26"/>
-              </w:rPr>
-              <w:t>@gmail.com</w:t>
-            </w:r>
-            <w:r>
-              <w:rPr>
-                <w:rStyle w:val="8"/>
-                <w:rFonts w:ascii="Times New Roman" w:hAnsi="Times New Roman" w:eastAsia="Calibri" w:cs="Times New Roman"/>
-                <w:sz w:val="26"/>
-                <w:szCs w:val="26"/>
-              </w:rPr>
-              <w:fldChar w:fldCharType="end"/>
-            </w:r>
-            <w:r>
-              <w:rPr>
-                <w:rFonts w:ascii="Times New Roman" w:hAnsi="Times New Roman" w:eastAsia="Calibri" w:cs="Times New Roman"/>
-                <w:sz w:val="26"/>
-                <w:szCs w:val="26"/>
-              </w:rPr>
-              <w:t xml:space="preserve"> </w:t>
-            </w:r>
-          </w:p>
-        </w:tc>
-        <w:tc>
-          <w:tcPr>
-            <w:tcW w:w="1825" w:type="dxa"/>
-          </w:tcPr>
-          <w:p>
-            <w:pPr>
-              <w:spacing w:after="0" w:line="360" w:lineRule="auto"/>
-              <w:jc w:val="both"/>
-              <w:rPr>
-                <w:rFonts w:ascii="Times New Roman" w:hAnsi="Times New Roman" w:eastAsia="Calibri" w:cs="Times New Roman"/>
-                <w:sz w:val="26"/>
-                <w:szCs w:val="26"/>
-              </w:rPr>
-            </w:pPr>
-            <w:r>
-              <w:rPr>
-                <w:rFonts w:ascii="Times New Roman" w:hAnsi="Times New Roman" w:eastAsia="Calibri" w:cs="Times New Roman"/>
-                <w:sz w:val="26"/>
-                <w:szCs w:val="26"/>
-              </w:rPr>
-              <w:t>090……….</w:t>
+              <w:rPr>
+                <w:rFonts w:hint="default" w:ascii="Times New Roman" w:hAnsi="Times New Roman" w:cs="Times New Roman"/>
+                <w:sz w:val="26"/>
+                <w:szCs w:val="26"/>
+                <w:shd w:val="clear" w:color="auto" w:fill="E4E6EB"/>
+                <w:lang w:val="en-US"/>
+              </w:rPr>
+              <w:t>Thành viên</w:t>
             </w:r>
           </w:p>
         </w:tc>
@@ -1592,14 +1739,14 @@
         </w:trPr>
         <w:tc>
           <w:tcPr>
-            <w:tcW w:w="1701" w:type="dxa"/>
+            <w:tcW w:w="1690" w:type="dxa"/>
             <w:vMerge w:val="restart"/>
             <w:shd w:val="clear" w:color="auto" w:fill="DBE5F1" w:themeFill="accent1" w:themeFillTint="33"/>
+            <w:vAlign w:val="top"/>
           </w:tcPr>
           <w:p>
             <w:pPr>
               <w:spacing w:after="0" w:line="360" w:lineRule="auto"/>
-              <w:jc w:val="both"/>
               <w:rPr>
                 <w:rFonts w:ascii="Times New Roman" w:hAnsi="Times New Roman" w:eastAsia="Calibri" w:cs="Times New Roman"/>
                 <w:b/>
@@ -1609,61 +1756,96 @@
             </w:pPr>
             <w:r>
               <w:rPr>
+                <w:rFonts w:hint="default" w:ascii="Times New Roman" w:hAnsi="Times New Roman" w:cs="Times New Roman"/>
+                <w:b/>
+                <w:sz w:val="26"/>
+                <w:szCs w:val="26"/>
+                <w:lang w:val="en-US"/>
+              </w:rPr>
+              <w:t>Thành Viên</w:t>
+            </w:r>
+          </w:p>
+        </w:tc>
+        <w:tc>
+          <w:tcPr>
+            <w:tcW w:w="1923" w:type="dxa"/>
+            <w:gridSpan w:val="2"/>
+            <w:vAlign w:val="top"/>
+          </w:tcPr>
+          <w:p>
+            <w:pPr>
+              <w:spacing w:after="0" w:line="360" w:lineRule="auto"/>
+              <w:rPr>
                 <w:rFonts w:ascii="Times New Roman" w:hAnsi="Times New Roman" w:eastAsia="Calibri" w:cs="Times New Roman"/>
-                <w:b/>
-                <w:sz w:val="26"/>
-                <w:szCs w:val="26"/>
-              </w:rPr>
-              <w:t>Thành viên trong đội</w:t>
-            </w:r>
-          </w:p>
-        </w:tc>
-        <w:tc>
-          <w:tcPr>
-            <w:tcW w:w="1901" w:type="dxa"/>
+                <w:sz w:val="26"/>
+                <w:szCs w:val="26"/>
+              </w:rPr>
+            </w:pPr>
+            <w:r>
+              <w:rPr>
+                <w:rFonts w:hint="default" w:ascii="Times New Roman" w:hAnsi="Times New Roman" w:eastAsia="Segoe UI" w:cs="Times New Roman"/>
+                <w:i w:val="0"/>
+                <w:iCs w:val="0"/>
+                <w:caps w:val="0"/>
+                <w:color w:val="081B3A"/>
+                <w:spacing w:val="2"/>
+                <w:sz w:val="26"/>
+                <w:szCs w:val="26"/>
+                <w:shd w:val="clear" w:fill="FFFFFF"/>
+              </w:rPr>
+              <w:t>29214653925</w:t>
+            </w:r>
+          </w:p>
+        </w:tc>
+        <w:tc>
+          <w:tcPr>
+            <w:tcW w:w="3806" w:type="dxa"/>
+            <w:vAlign w:val="top"/>
           </w:tcPr>
           <w:p>
             <w:pPr>
               <w:spacing w:after="0" w:line="360" w:lineRule="auto"/>
-              <w:jc w:val="both"/>
               <w:rPr>
                 <w:rFonts w:ascii="Times New Roman" w:hAnsi="Times New Roman" w:eastAsia="Calibri" w:cs="Times New Roman"/>
                 <w:sz w:val="26"/>
                 <w:szCs w:val="26"/>
               </w:rPr>
             </w:pPr>
-          </w:p>
-        </w:tc>
-        <w:tc>
-          <w:tcPr>
-            <w:tcW w:w="3929" w:type="dxa"/>
+            <w:r>
+              <w:rPr>
+                <w:rFonts w:hint="default" w:ascii="Times New Roman" w:hAnsi="Times New Roman" w:cs="Times New Roman"/>
+                <w:sz w:val="26"/>
+                <w:szCs w:val="26"/>
+                <w:lang w:val="en-US"/>
+              </w:rPr>
+              <w:t>Trần Tấn Huy</w:t>
+            </w:r>
+          </w:p>
+        </w:tc>
+        <w:tc>
+          <w:tcPr>
+            <w:tcW w:w="1869" w:type="dxa"/>
+            <w:vAlign w:val="top"/>
           </w:tcPr>
           <w:p>
             <w:pPr>
               <w:spacing w:after="0" w:line="360" w:lineRule="auto"/>
-              <w:jc w:val="both"/>
               <w:rPr>
                 <w:rFonts w:ascii="Times New Roman" w:hAnsi="Times New Roman" w:eastAsia="Calibri" w:cs="Times New Roman"/>
                 <w:sz w:val="26"/>
                 <w:szCs w:val="26"/>
               </w:rPr>
             </w:pPr>
-          </w:p>
-        </w:tc>
-        <w:tc>
-          <w:tcPr>
-            <w:tcW w:w="1825" w:type="dxa"/>
-          </w:tcPr>
-          <w:p>
-            <w:pPr>
-              <w:spacing w:after="0" w:line="360" w:lineRule="auto"/>
-              <w:jc w:val="both"/>
-              <w:rPr>
-                <w:rFonts w:ascii="Times New Roman" w:hAnsi="Times New Roman" w:eastAsia="Calibri" w:cs="Times New Roman"/>
-                <w:sz w:val="26"/>
-                <w:szCs w:val="26"/>
-              </w:rPr>
-            </w:pPr>
+            <w:r>
+              <w:rPr>
+                <w:rFonts w:hint="default" w:ascii="Times New Roman" w:hAnsi="Times New Roman" w:cs="Times New Roman"/>
+                <w:sz w:val="26"/>
+                <w:szCs w:val="26"/>
+                <w:shd w:val="clear" w:color="auto" w:fill="E4E6EB"/>
+                <w:lang w:val="en-US"/>
+              </w:rPr>
+              <w:t>Thành viên</w:t>
+            </w:r>
           </w:p>
         </w:tc>
       </w:tr>
@@ -1689,14 +1871,14 @@
         </w:trPr>
         <w:tc>
           <w:tcPr>
-            <w:tcW w:w="1701" w:type="dxa"/>
+            <w:tcW w:w="1690" w:type="dxa"/>
             <w:vMerge w:val="continue"/>
             <w:shd w:val="clear" w:color="auto" w:fill="DBE5F1" w:themeFill="accent1" w:themeFillTint="33"/>
+            <w:vAlign w:val="top"/>
           </w:tcPr>
           <w:p>
             <w:pPr>
               <w:spacing w:after="0" w:line="360" w:lineRule="auto"/>
-              <w:jc w:val="both"/>
               <w:rPr>
                 <w:rFonts w:ascii="Times New Roman" w:hAnsi="Times New Roman" w:eastAsia="Calibri" w:cs="Times New Roman"/>
                 <w:sz w:val="26"/>
@@ -1707,50 +1889,84 @@
         </w:tc>
         <w:tc>
           <w:tcPr>
-            <w:tcW w:w="1901" w:type="dxa"/>
+            <w:tcW w:w="1923" w:type="dxa"/>
+            <w:gridSpan w:val="2"/>
+            <w:vAlign w:val="top"/>
           </w:tcPr>
           <w:p>
             <w:pPr>
               <w:spacing w:after="0" w:line="360" w:lineRule="auto"/>
-              <w:jc w:val="both"/>
               <w:rPr>
                 <w:rFonts w:ascii="Times New Roman" w:hAnsi="Times New Roman" w:eastAsia="Calibri" w:cs="Times New Roman"/>
                 <w:sz w:val="26"/>
                 <w:szCs w:val="26"/>
               </w:rPr>
             </w:pPr>
-          </w:p>
-        </w:tc>
-        <w:tc>
-          <w:tcPr>
-            <w:tcW w:w="3929" w:type="dxa"/>
+            <w:r>
+              <w:rPr>
+                <w:rFonts w:hint="default" w:ascii="Times New Roman" w:hAnsi="Times New Roman" w:eastAsia="Segoe UI" w:cs="Times New Roman"/>
+                <w:i w:val="0"/>
+                <w:iCs w:val="0"/>
+                <w:caps w:val="0"/>
+                <w:color w:val="081B3A"/>
+                <w:spacing w:val="2"/>
+                <w:sz w:val="26"/>
+                <w:szCs w:val="26"/>
+                <w:shd w:val="clear" w:fill="FFFFFF"/>
+              </w:rPr>
+              <w:t>27211201759</w:t>
+            </w:r>
+          </w:p>
+        </w:tc>
+        <w:tc>
+          <w:tcPr>
+            <w:tcW w:w="3806" w:type="dxa"/>
+            <w:vAlign w:val="top"/>
           </w:tcPr>
           <w:p>
             <w:pPr>
               <w:spacing w:after="0" w:line="360" w:lineRule="auto"/>
-              <w:jc w:val="both"/>
               <w:rPr>
                 <w:rFonts w:ascii="Times New Roman" w:hAnsi="Times New Roman" w:eastAsia="Calibri" w:cs="Times New Roman"/>
                 <w:sz w:val="26"/>
                 <w:szCs w:val="26"/>
               </w:rPr>
             </w:pPr>
-          </w:p>
-        </w:tc>
-        <w:tc>
-          <w:tcPr>
-            <w:tcW w:w="1825" w:type="dxa"/>
+            <w:r>
+              <w:rPr>
+                <w:rFonts w:hint="default" w:ascii="Times New Roman" w:hAnsi="Times New Roman" w:cs="Times New Roman" w:eastAsiaTheme="majorEastAsia"/>
+                <w:sz w:val="26"/>
+                <w:szCs w:val="26"/>
+                <w:lang w:val="en-US"/>
+              </w:rPr>
+              <w:t>Nguyễn Minh Khôi</w:t>
+            </w:r>
+          </w:p>
+        </w:tc>
+        <w:tc>
+          <w:tcPr>
+            <w:tcW w:w="1869" w:type="dxa"/>
+            <w:vAlign w:val="top"/>
           </w:tcPr>
           <w:p>
             <w:pPr>
               <w:spacing w:after="0" w:line="360" w:lineRule="auto"/>
-              <w:jc w:val="both"/>
               <w:rPr>
                 <w:rFonts w:ascii="Times New Roman" w:hAnsi="Times New Roman" w:eastAsia="Calibri" w:cs="Times New Roman"/>
                 <w:sz w:val="26"/>
                 <w:szCs w:val="26"/>
               </w:rPr>
             </w:pPr>
+            <w:r>
+              <w:rPr>
+                <w:rFonts w:hint="default" w:ascii="Times New Roman" w:hAnsi="Times New Roman" w:cs="Times New Roman"/>
+                <w:sz w:val="26"/>
+                <w:szCs w:val="26"/>
+                <w:shd w:val="clear" w:color="auto" w:fill="E4E6EB"/>
+                <w:lang w:val="en-US"/>
+              </w:rPr>
+              <w:t>Thành viên</w:t>
+            </w:r>
           </w:p>
         </w:tc>
       </w:tr>
@@ -1776,155 +1992,54 @@
         </w:trPr>
         <w:tc>
           <w:tcPr>
-            <w:tcW w:w="1701" w:type="dxa"/>
-            <w:vMerge w:val="continue"/>
+            <w:tcW w:w="1690" w:type="dxa"/>
             <w:shd w:val="clear" w:color="auto" w:fill="DBE5F1" w:themeFill="accent1" w:themeFillTint="33"/>
+            <w:vAlign w:val="top"/>
           </w:tcPr>
           <w:p>
             <w:pPr>
               <w:spacing w:after="0" w:line="360" w:lineRule="auto"/>
-              <w:jc w:val="both"/>
               <w:rPr>
                 <w:rFonts w:ascii="Times New Roman" w:hAnsi="Times New Roman" w:eastAsia="Calibri" w:cs="Times New Roman"/>
                 <w:sz w:val="26"/>
                 <w:szCs w:val="26"/>
               </w:rPr>
             </w:pPr>
-          </w:p>
-        </w:tc>
-        <w:tc>
-          <w:tcPr>
-            <w:tcW w:w="1901" w:type="dxa"/>
+            <w:r>
+              <w:rPr>
+                <w:rFonts w:ascii="Times New Roman" w:hAnsi="Times New Roman" w:cs="Times New Roman"/>
+                <w:b/>
+                <w:sz w:val="26"/>
+                <w:szCs w:val="26"/>
+              </w:rPr>
+              <w:t>Dự án viết tắt</w:t>
+            </w:r>
+          </w:p>
+        </w:tc>
+        <w:tc>
+          <w:tcPr>
+            <w:tcW w:w="7598" w:type="dxa"/>
+            <w:gridSpan w:val="4"/>
+            <w:vAlign w:val="top"/>
           </w:tcPr>
           <w:p>
             <w:pPr>
               <w:spacing w:after="0" w:line="360" w:lineRule="auto"/>
-              <w:jc w:val="both"/>
               <w:rPr>
                 <w:rFonts w:ascii="Times New Roman" w:hAnsi="Times New Roman" w:eastAsia="Calibri" w:cs="Times New Roman"/>
                 <w:sz w:val="26"/>
                 <w:szCs w:val="26"/>
               </w:rPr>
             </w:pPr>
-          </w:p>
-        </w:tc>
-        <w:tc>
-          <w:tcPr>
-            <w:tcW w:w="3929" w:type="dxa"/>
-          </w:tcPr>
-          <w:p>
-            <w:pPr>
-              <w:spacing w:after="0" w:line="360" w:lineRule="auto"/>
-              <w:jc w:val="both"/>
-              <w:rPr>
-                <w:rFonts w:ascii="Times New Roman" w:hAnsi="Times New Roman" w:eastAsia="Calibri" w:cs="Times New Roman"/>
-                <w:sz w:val="26"/>
-                <w:szCs w:val="26"/>
-              </w:rPr>
-            </w:pPr>
-          </w:p>
-        </w:tc>
-        <w:tc>
-          <w:tcPr>
-            <w:tcW w:w="1825" w:type="dxa"/>
-          </w:tcPr>
-          <w:p>
-            <w:pPr>
-              <w:spacing w:after="0" w:line="360" w:lineRule="auto"/>
-              <w:jc w:val="both"/>
-              <w:rPr>
-                <w:rFonts w:ascii="Times New Roman" w:hAnsi="Times New Roman" w:eastAsia="Calibri" w:cs="Times New Roman"/>
-                <w:sz w:val="26"/>
-                <w:szCs w:val="26"/>
-              </w:rPr>
-            </w:pPr>
-          </w:p>
-        </w:tc>
-      </w:tr>
-      <w:tr>
-        <w:tblPrEx>
-          <w:tblBorders>
-            <w:top w:val="single" w:color="auto" w:sz="4" w:space="0"/>
-            <w:left w:val="single" w:color="auto" w:sz="4" w:space="0"/>
-            <w:bottom w:val="single" w:color="auto" w:sz="4" w:space="0"/>
-            <w:right w:val="single" w:color="auto" w:sz="4" w:space="0"/>
-            <w:insideH w:val="single" w:color="auto" w:sz="4" w:space="0"/>
-            <w:insideV w:val="single" w:color="auto" w:sz="4" w:space="0"/>
-          </w:tblBorders>
-          <w:tblCellMar>
-            <w:top w:w="0" w:type="dxa"/>
-            <w:left w:w="108" w:type="dxa"/>
-            <w:bottom w:w="0" w:type="dxa"/>
-            <w:right w:w="108" w:type="dxa"/>
-          </w:tblCellMar>
-        </w:tblPrEx>
-        <w:trPr>
-          <w:jc w:val="center"/>
-        </w:trPr>
-        <w:tc>
-          <w:tcPr>
-            <w:tcW w:w="1701" w:type="dxa"/>
-            <w:vMerge w:val="continue"/>
-            <w:shd w:val="clear" w:color="auto" w:fill="DBE5F1" w:themeFill="accent1" w:themeFillTint="33"/>
-          </w:tcPr>
-          <w:p>
-            <w:pPr>
-              <w:spacing w:after="0" w:line="360" w:lineRule="auto"/>
-              <w:jc w:val="both"/>
-              <w:rPr>
-                <w:rFonts w:ascii="Times New Roman" w:hAnsi="Times New Roman" w:eastAsia="Calibri" w:cs="Times New Roman"/>
-                <w:sz w:val="26"/>
-                <w:szCs w:val="26"/>
-              </w:rPr>
-            </w:pPr>
-          </w:p>
-        </w:tc>
-        <w:tc>
-          <w:tcPr>
-            <w:tcW w:w="1901" w:type="dxa"/>
-          </w:tcPr>
-          <w:p>
-            <w:pPr>
-              <w:spacing w:after="0" w:line="360" w:lineRule="auto"/>
-              <w:jc w:val="both"/>
-              <w:rPr>
-                <w:rFonts w:ascii="Times New Roman" w:hAnsi="Times New Roman" w:eastAsia="Calibri" w:cs="Times New Roman"/>
-                <w:sz w:val="26"/>
-                <w:szCs w:val="26"/>
-              </w:rPr>
-            </w:pPr>
-          </w:p>
-        </w:tc>
-        <w:tc>
-          <w:tcPr>
-            <w:tcW w:w="3929" w:type="dxa"/>
-          </w:tcPr>
-          <w:p>
-            <w:pPr>
-              <w:spacing w:after="0" w:line="360" w:lineRule="auto"/>
-              <w:jc w:val="both"/>
-              <w:rPr>
-                <w:rFonts w:ascii="Times New Roman" w:hAnsi="Times New Roman" w:eastAsia="Calibri" w:cs="Times New Roman"/>
-                <w:sz w:val="26"/>
-                <w:szCs w:val="26"/>
-              </w:rPr>
-            </w:pPr>
-          </w:p>
-        </w:tc>
-        <w:tc>
-          <w:tcPr>
-            <w:tcW w:w="1825" w:type="dxa"/>
-          </w:tcPr>
-          <w:p>
-            <w:pPr>
-              <w:spacing w:after="0" w:line="360" w:lineRule="auto"/>
-              <w:jc w:val="both"/>
-              <w:rPr>
-                <w:rFonts w:ascii="Times New Roman" w:hAnsi="Times New Roman" w:eastAsia="Calibri" w:cs="Times New Roman"/>
-                <w:sz w:val="26"/>
-                <w:szCs w:val="26"/>
-              </w:rPr>
-            </w:pPr>
+            <w:r>
+              <w:rPr>
+                <w:rFonts w:hint="default" w:ascii="Times New Roman" w:hAnsi="Times New Roman" w:cs="Times New Roman"/>
+                <w:sz w:val="26"/>
+                <w:szCs w:val="26"/>
+                <w:lang w:val="en-US"/>
+              </w:rPr>
+              <w:t>SMARTTRIAL</w:t>
+            </w:r>
           </w:p>
         </w:tc>
       </w:tr>
@@ -2003,8 +2118,8 @@
         </w:tblCellMar>
       </w:tblPr>
       <w:tblGrid>
-        <w:gridCol w:w="2394"/>
-        <w:gridCol w:w="6894"/>
+        <w:gridCol w:w="2393"/>
+        <w:gridCol w:w="6895"/>
       </w:tblGrid>
       <w:tr>
         <w:tblPrEx>
@@ -2061,18 +2176,20 @@
             <w:pPr>
               <w:spacing w:after="0" w:line="360" w:lineRule="auto"/>
               <w:rPr>
-                <w:rFonts w:ascii="Times New Roman" w:hAnsi="Times New Roman" w:cs="Times New Roman"/>
-                <w:sz w:val="26"/>
-                <w:szCs w:val="26"/>
-              </w:rPr>
-            </w:pPr>
-            <w:r>
-              <w:rPr>
-                <w:rFonts w:ascii="Times New Roman" w:hAnsi="Times New Roman" w:cs="Times New Roman"/>
-                <w:sz w:val="26"/>
-                <w:szCs w:val="26"/>
-              </w:rPr>
-              <w:t>Xây dựng website bán hàng tích hợp AI tìm kiếm</w:t>
+                <w:rFonts w:hint="default" w:ascii="Times New Roman" w:hAnsi="Times New Roman" w:cs="Times New Roman"/>
+                <w:sz w:val="26"/>
+                <w:szCs w:val="26"/>
+                <w:lang w:val="en-US"/>
+              </w:rPr>
+            </w:pPr>
+            <w:r>
+              <w:rPr>
+                <w:rFonts w:hint="default" w:ascii="Times New Roman" w:hAnsi="Times New Roman" w:cs="Times New Roman"/>
+                <w:sz w:val="26"/>
+                <w:szCs w:val="26"/>
+                <w:lang w:val="en-US"/>
+              </w:rPr>
+              <w:t>SMATTRIAL-Nền tảng đặt lịch học thử và tư vấn trực tuyến realtime với cơ chế xếp lịch thông minh</w:t>
             </w:r>
           </w:p>
         </w:tc>
@@ -9227,6 +9344,12 @@
             <w:insideH w:val="single" w:color="auto" w:sz="4" w:space="0"/>
             <w:insideV w:val="single" w:color="auto" w:sz="4" w:space="0"/>
           </w:tblBorders>
+          <w:tblCellMar>
+            <w:top w:w="0" w:type="dxa"/>
+            <w:left w:w="10" w:type="dxa"/>
+            <w:bottom w:w="0" w:type="dxa"/>
+            <w:right w:w="10" w:type="dxa"/>
+          </w:tblCellMar>
         </w:tblPrEx>
         <w:trPr>
           <w:trHeight w:val="554" w:hRule="atLeast"/>
@@ -11648,8 +11771,6 @@
           <w:szCs w:val="26"/>
         </w:rPr>
       </w:pPr>
-      <w:bookmarkStart w:id="19" w:name="_GoBack"/>
-      <w:bookmarkEnd w:id="19"/>
     </w:p>
     <w:tbl>
       <w:tblPr>
@@ -14952,7 +15073,7 @@
     <w:lsdException w:unhideWhenUsed="0" w:uiPriority="65" w:semiHidden="0" w:name="Medium List 1 Accent 1"/>
     <w:lsdException w:qFormat="1" w:unhideWhenUsed="0" w:uiPriority="34" w:semiHidden="0" w:name="List Paragraph"/>
     <w:lsdException w:unhideWhenUsed="0" w:uiPriority="66" w:semiHidden="0" w:name="Medium List 2 Accent 1"/>
-    <w:lsdException w:unhideWhenUsed="0" w:uiPriority="67" w:semiHidden="0" w:name="Medium Grid 1 Accent 1"/>
+    <w:lsdException w:qFormat="1" w:unhideWhenUsed="0" w:uiPriority="67" w:semiHidden="0" w:name="Medium Grid 1 Accent 1"/>
     <w:lsdException w:unhideWhenUsed="0" w:uiPriority="68" w:semiHidden="0" w:name="Medium Grid 2 Accent 1"/>
     <w:lsdException w:unhideWhenUsed="0" w:uiPriority="69" w:semiHidden="0" w:name="Medium Grid 3 Accent 1"/>
     <w:lsdException w:unhideWhenUsed="0" w:uiPriority="70" w:semiHidden="0" w:name="Dark List Accent 1"/>

</xml_diff>